<commit_message>
Add verified company experience to career document
</commit_message>
<xml_diff>
--- a/public/documents/김건희_경력기술서.docx
+++ b/public/documents/김건희_경력기술서.docx
@@ -7,18 +7,15 @@
         <w:pStyle w:val="Title"/>
       </w:pPr>
       <w:r>
-        <w:t>프로젝트 경험 기술서</w:t>
+        <w:t>김건희 경력기술서</w:t>
       </w:r>
     </w:p>
     <w:p>
-      <w:pPr>
-        <w:spacing w:after="280"/>
-      </w:pPr>
       <w:r>
         <w:rPr>
           <w:b/>
         </w:rPr>
-        <w:t>김건희 · 상황·행동·결과와 세 능력의 근거</w:t>
+        <w:t>웹 서비스의 기획부터 운영까지 연결한 프론트엔드 개발 경험</w:t>
       </w:r>
     </w:p>
     <w:p>
@@ -30,8 +27,678 @@
       </w:r>
     </w:p>
     <w:p>
+      <w:pPr>
+        <w:pStyle w:val="Heading1"/>
+      </w:pPr>
       <w:r>
-        <w:t>확인된 날짜와 기록만 사용했습니다. 수치 성과와 전체 수행기간은 자료가 없으면 비워 두었습니다.</w:t>
+        <w:t>경력 요약</w:t>
+      </w:r>
+    </w:p>
+    <w:p>
+      <w:r>
+        <w:t>스타 법무법인 전략기획본부에서 주임·팀원으로 웹개발을 담당했습니다. 단독 프론트엔드 개발을 중심으로 기획·디자인·백엔드·협력업체와 협업해 사내 운영 도구, 홈페이지, 신규 플랫폼과 콘텐츠 관리 시스템을 만들었으며, 이후 백엔드 데이터 구조 설계에도 참여했습니다.</w:t>
+      </w:r>
+    </w:p>
+    <w:tbl>
+      <w:tblPr>
+        <w:tblW w:type="auto" w:w="0"/>
+        <w:tblLayout w:type="fixed"/>
+        <w:tblLook w:firstColumn="1" w:firstRow="1" w:lastColumn="0" w:lastRow="0" w:noHBand="0" w:noVBand="1" w:val="04A0"/>
+      </w:tblPr>
+      <w:tblGrid>
+        <w:gridCol w:w="4997"/>
+        <w:gridCol w:w="4997"/>
+      </w:tblGrid>
+      <w:tr>
+        <w:tc>
+          <w:tcPr>
+            <w:tcW w:type="dxa" w:w="1800"/>
+            <w:vAlign w:val="center"/>
+            <w:tcBorders>
+              <w:top w:val="single" w:sz="4" w:color="D9D9D9"/>
+              <w:left w:val="single" w:sz="4" w:color="D9D9D9"/>
+              <w:bottom w:val="single" w:sz="4" w:color="D9D9D9"/>
+              <w:right w:val="single" w:sz="4" w:color="D9D9D9"/>
+            </w:tcBorders>
+            <w:shd w:fill="E5EAE5"/>
+          </w:tcPr>
+          <w:p>
+            <w:r>
+              <w:rPr>
+                <w:b/>
+              </w:rPr>
+              <w:t>회사</w:t>
+            </w:r>
+          </w:p>
+        </w:tc>
+        <w:tc>
+          <w:tcPr>
+            <w:tcW w:type="dxa" w:w="7992"/>
+            <w:vAlign w:val="center"/>
+            <w:tcBorders>
+              <w:top w:val="single" w:sz="4" w:color="D9D9D9"/>
+              <w:left w:val="single" w:sz="4" w:color="D9D9D9"/>
+              <w:bottom w:val="single" w:sz="4" w:color="D9D9D9"/>
+              <w:right w:val="single" w:sz="4" w:color="D9D9D9"/>
+            </w:tcBorders>
+          </w:tcPr>
+          <w:p>
+            <w:r>
+              <w:t>스타 법무법인</w:t>
+            </w:r>
+          </w:p>
+        </w:tc>
+      </w:tr>
+      <w:tr>
+        <w:tc>
+          <w:tcPr>
+            <w:tcW w:type="dxa" w:w="1800"/>
+            <w:vAlign w:val="center"/>
+            <w:tcBorders>
+              <w:top w:val="single" w:sz="4" w:color="D9D9D9"/>
+              <w:left w:val="single" w:sz="4" w:color="D9D9D9"/>
+              <w:bottom w:val="single" w:sz="4" w:color="D9D9D9"/>
+              <w:right w:val="single" w:sz="4" w:color="D9D9D9"/>
+            </w:tcBorders>
+            <w:shd w:fill="E5EAE5"/>
+          </w:tcPr>
+          <w:p>
+            <w:r>
+              <w:rPr>
+                <w:b/>
+              </w:rPr>
+              <w:t>소속과 역할</w:t>
+            </w:r>
+          </w:p>
+        </w:tc>
+        <w:tc>
+          <w:tcPr>
+            <w:tcW w:type="dxa" w:w="7992"/>
+            <w:vAlign w:val="center"/>
+            <w:tcBorders>
+              <w:top w:val="single" w:sz="4" w:color="D9D9D9"/>
+              <w:left w:val="single" w:sz="4" w:color="D9D9D9"/>
+              <w:bottom w:val="single" w:sz="4" w:color="D9D9D9"/>
+              <w:right w:val="single" w:sz="4" w:color="D9D9D9"/>
+            </w:tcBorders>
+          </w:tcPr>
+          <w:p>
+            <w:r>
+              <w:t>전략기획본부 · 주임/팀원 · 웹개발</w:t>
+            </w:r>
+          </w:p>
+        </w:tc>
+      </w:tr>
+      <w:tr>
+        <w:tc>
+          <w:tcPr>
+            <w:tcW w:type="dxa" w:w="1800"/>
+            <w:vAlign w:val="center"/>
+            <w:tcBorders>
+              <w:top w:val="single" w:sz="4" w:color="D9D9D9"/>
+              <w:left w:val="single" w:sz="4" w:color="D9D9D9"/>
+              <w:bottom w:val="single" w:sz="4" w:color="D9D9D9"/>
+              <w:right w:val="single" w:sz="4" w:color="D9D9D9"/>
+            </w:tcBorders>
+            <w:shd w:fill="E5EAE5"/>
+          </w:tcPr>
+          <w:p>
+            <w:r>
+              <w:rPr>
+                <w:b/>
+              </w:rPr>
+              <w:t>근무기간</w:t>
+            </w:r>
+          </w:p>
+        </w:tc>
+        <w:tc>
+          <w:tcPr>
+            <w:tcW w:type="dxa" w:w="7992"/>
+            <w:vAlign w:val="center"/>
+            <w:tcBorders>
+              <w:top w:val="single" w:sz="4" w:color="D9D9D9"/>
+              <w:left w:val="single" w:sz="4" w:color="D9D9D9"/>
+              <w:bottom w:val="single" w:sz="4" w:color="D9D9D9"/>
+              <w:right w:val="single" w:sz="4" w:color="D9D9D9"/>
+            </w:tcBorders>
+          </w:tcPr>
+          <w:p>
+            <w:r>
+              <w:t>2023.02~2025.06 · 2년 5개월</w:t>
+            </w:r>
+          </w:p>
+        </w:tc>
+      </w:tr>
+      <w:tr>
+        <w:tc>
+          <w:tcPr>
+            <w:tcW w:type="dxa" w:w="1800"/>
+            <w:vAlign w:val="center"/>
+            <w:tcBorders>
+              <w:top w:val="single" w:sz="4" w:color="D9D9D9"/>
+              <w:left w:val="single" w:sz="4" w:color="D9D9D9"/>
+              <w:bottom w:val="single" w:sz="4" w:color="D9D9D9"/>
+              <w:right w:val="single" w:sz="4" w:color="D9D9D9"/>
+            </w:tcBorders>
+            <w:shd w:fill="E5EAE5"/>
+          </w:tcPr>
+          <w:p>
+            <w:r>
+              <w:rPr>
+                <w:b/>
+              </w:rPr>
+              <w:t>주요 기술</w:t>
+            </w:r>
+          </w:p>
+        </w:tc>
+        <w:tc>
+          <w:tcPr>
+            <w:tcW w:type="dxa" w:w="7992"/>
+            <w:vAlign w:val="center"/>
+            <w:tcBorders>
+              <w:top w:val="single" w:sz="4" w:color="D9D9D9"/>
+              <w:left w:val="single" w:sz="4" w:color="D9D9D9"/>
+              <w:bottom w:val="single" w:sz="4" w:color="D9D9D9"/>
+              <w:right w:val="single" w:sz="4" w:color="D9D9D9"/>
+            </w:tcBorders>
+          </w:tcPr>
+          <w:p>
+            <w:r>
+              <w:t>TypeScript · Next.js · React · Recoil · PostgreSQL · CSS · MUI · AWS · Docker · QGIS</w:t>
+            </w:r>
+          </w:p>
+        </w:tc>
+      </w:tr>
+      <w:tr>
+        <w:tc>
+          <w:tcPr>
+            <w:tcW w:type="dxa" w:w="1800"/>
+            <w:vAlign w:val="center"/>
+            <w:tcBorders>
+              <w:top w:val="single" w:sz="4" w:color="D9D9D9"/>
+              <w:left w:val="single" w:sz="4" w:color="D9D9D9"/>
+              <w:bottom w:val="single" w:sz="4" w:color="D9D9D9"/>
+              <w:right w:val="single" w:sz="4" w:color="D9D9D9"/>
+            </w:tcBorders>
+            <w:shd w:fill="E5EAE5"/>
+          </w:tcPr>
+          <w:p>
+            <w:r>
+              <w:rPr>
+                <w:b/>
+              </w:rPr>
+              <w:t>협업 도구</w:t>
+            </w:r>
+          </w:p>
+        </w:tc>
+        <w:tc>
+          <w:tcPr>
+            <w:tcW w:type="dxa" w:w="7992"/>
+            <w:vAlign w:val="center"/>
+            <w:tcBorders>
+              <w:top w:val="single" w:sz="4" w:color="D9D9D9"/>
+              <w:left w:val="single" w:sz="4" w:color="D9D9D9"/>
+              <w:bottom w:val="single" w:sz="4" w:color="D9D9D9"/>
+              <w:right w:val="single" w:sz="4" w:color="D9D9D9"/>
+            </w:tcBorders>
+          </w:tcPr>
+          <w:p>
+            <w:r>
+              <w:t>Git · Notion · Figma · Slack</w:t>
+            </w:r>
+          </w:p>
+        </w:tc>
+      </w:tr>
+    </w:tbl>
+    <w:p/>
+    <w:p>
+      <w:pPr>
+        <w:pStyle w:val="Heading1"/>
+      </w:pPr>
+      <w:r>
+        <w:t>주요 프로젝트</w:t>
+      </w:r>
+    </w:p>
+    <w:p>
+      <w:pPr>
+        <w:pStyle w:val="Heading2"/>
+      </w:pPr>
+      <w:r>
+        <w:t>1 사내 통계 데이터 대시보드 및 업무 관리 사이트</w:t>
+      </w:r>
+    </w:p>
+    <w:p>
+      <w:r>
+        <w:rPr>
+          <w:b/>
+        </w:rPr>
+        <w:t xml:space="preserve">기간  </w:t>
+      </w:r>
+      <w:r>
+        <w:t>2023.05~2024.07</w:t>
+      </w:r>
+      <w:r>
+        <w:rPr>
+          <w:b/>
+        </w:rPr>
+        <w:t xml:space="preserve">    구성  </w:t>
+      </w:r>
+      <w:r>
+        <w:t>프론트엔드 1명 · 백엔드 1명 · 기획 2명</w:t>
+      </w:r>
+    </w:p>
+    <w:p>
+      <w:pPr>
+        <w:keepNext/>
+      </w:pPr>
+      <w:r>
+        <w:rPr>
+          <w:b/>
+        </w:rPr>
+        <w:t>주요 업무</w:t>
+      </w:r>
+    </w:p>
+    <w:p>
+      <w:pPr>
+        <w:pStyle w:val="ListBullet"/>
+      </w:pPr>
+      <w:r>
+        <w:t>인증·권한에 따른 사용자 흐름을 개선하고 페이지 기획에 참여</w:t>
+      </w:r>
+    </w:p>
+    <w:p>
+      <w:pPr>
+        <w:pStyle w:val="ListBullet"/>
+      </w:pPr>
+      <w:r>
+        <w:t>데이터 집계 결과를 시각화하는 기능 개발</w:t>
+      </w:r>
+    </w:p>
+    <w:p>
+      <w:pPr>
+        <w:pStyle w:val="ListBullet"/>
+      </w:pPr>
+      <w:r>
+        <w:t>REST API 통신을 위한 데이터 형식을 설계하고 백엔드 개발자와 협업</w:t>
+      </w:r>
+    </w:p>
+    <w:p>
+      <w:pPr>
+        <w:pStyle w:val="ListBullet"/>
+      </w:pPr>
+      <w:r>
+        <w:t>UI와 UX를 직접 개선하고 운영 중인 화면을 유지보수</w:t>
+      </w:r>
+    </w:p>
+    <w:p>
+      <w:pPr>
+        <w:keepNext/>
+      </w:pPr>
+      <w:r>
+        <w:rPr>
+          <w:b/>
+        </w:rPr>
+        <w:t>주요 성과</w:t>
+      </w:r>
+    </w:p>
+    <w:p>
+      <w:pPr>
+        <w:pStyle w:val="ListBullet"/>
+      </w:pPr>
+      <w:r>
+        <w:t>데이터 집계를 자동화해 보고 작업 시간을 약 3시간 단축</w:t>
+      </w:r>
+    </w:p>
+    <w:p>
+      <w:pPr>
+        <w:pStyle w:val="ListBullet"/>
+      </w:pPr>
+      <w:r>
+        <w:t>운영 부서가 통계와 업무 현황을 확인하는 과정의 사용 편의 개선</w:t>
+      </w:r>
+    </w:p>
+    <w:p>
+      <w:pPr>
+        <w:pStyle w:val="Heading2"/>
+      </w:pPr>
+      <w:r>
+        <w:t>2 홈페이지 리뉴얼 및 유지보수</w:t>
+      </w:r>
+    </w:p>
+    <w:p>
+      <w:r>
+        <w:rPr>
+          <w:b/>
+        </w:rPr>
+        <w:t xml:space="preserve">기간  </w:t>
+      </w:r>
+      <w:r>
+        <w:t>2024.08~2025.02</w:t>
+      </w:r>
+      <w:r>
+        <w:rPr>
+          <w:b/>
+        </w:rPr>
+        <w:t xml:space="preserve">    구성  </w:t>
+      </w:r>
+      <w:r>
+        <w:t>프론트엔드 1명 · 디자인 1명</w:t>
+      </w:r>
+    </w:p>
+    <w:p>
+      <w:pPr>
+        <w:keepNext/>
+      </w:pPr>
+      <w:r>
+        <w:rPr>
+          <w:b/>
+        </w:rPr>
+        <w:t>주요 업무</w:t>
+      </w:r>
+    </w:p>
+    <w:p>
+      <w:pPr>
+        <w:pStyle w:val="ListBullet"/>
+      </w:pPr>
+      <w:r>
+        <w:t>PHP 기반 레거시 화면을 React 환경으로 전환</w:t>
+      </w:r>
+    </w:p>
+    <w:p>
+      <w:pPr>
+        <w:pStyle w:val="ListBullet"/>
+      </w:pPr>
+      <w:r>
+        <w:t>검색 노출을 위한 SEO 관리와 UI·UX 개선 및 유지보수</w:t>
+      </w:r>
+    </w:p>
+    <w:p>
+      <w:pPr>
+        <w:keepNext/>
+      </w:pPr>
+      <w:r>
+        <w:rPr>
+          <w:b/>
+        </w:rPr>
+        <w:t>주요 성과</w:t>
+      </w:r>
+    </w:p>
+    <w:p>
+      <w:pPr>
+        <w:pStyle w:val="ListBullet"/>
+      </w:pPr>
+      <w:r>
+        <w:t>화면 구조를 정리해 유지보수와 운영 편의 개선</w:t>
+      </w:r>
+    </w:p>
+    <w:p>
+      <w:pPr>
+        <w:pStyle w:val="ListBullet"/>
+      </w:pPr>
+      <w:r>
+        <w:t>PHP와 React 환경을 함께 사용할 수 있는 전환 구조 확보</w:t>
+      </w:r>
+    </w:p>
+    <w:p>
+      <w:pPr>
+        <w:pStyle w:val="Heading2"/>
+      </w:pPr>
+      <w:r>
+        <w:t>3 신규 플랫폼 개발</w:t>
+      </w:r>
+    </w:p>
+    <w:p>
+      <w:r>
+        <w:rPr>
+          <w:b/>
+        </w:rPr>
+        <w:t xml:space="preserve">기간  </w:t>
+      </w:r>
+      <w:r>
+        <w:t>2024.05</w:t>
+      </w:r>
+      <w:r>
+        <w:rPr>
+          <w:b/>
+        </w:rPr>
+        <w:t xml:space="preserve">    구성  </w:t>
+      </w:r>
+      <w:r>
+        <w:t>프론트엔드 1명 · 프로젝트 관리자 1명 · 협력업체 2명</w:t>
+      </w:r>
+    </w:p>
+    <w:p>
+      <w:pPr>
+        <w:keepNext/>
+      </w:pPr>
+      <w:r>
+        <w:rPr>
+          <w:b/>
+        </w:rPr>
+        <w:t>주요 업무</w:t>
+      </w:r>
+    </w:p>
+    <w:p>
+      <w:pPr>
+        <w:pStyle w:val="ListBullet"/>
+      </w:pPr>
+      <w:r>
+        <w:t>협력업체와 역할과 연동 범위를 조율하며 플랫폼 개발</w:t>
+      </w:r>
+    </w:p>
+    <w:p>
+      <w:pPr>
+        <w:pStyle w:val="ListBullet"/>
+      </w:pPr>
+      <w:r>
+        <w:t>REST API 통신을 위한 데이터 형식을 설계하고 백엔드 영역과 협업</w:t>
+      </w:r>
+    </w:p>
+    <w:p>
+      <w:pPr>
+        <w:pStyle w:val="ListBullet"/>
+      </w:pPr>
+      <w:r>
+        <w:t>SEO 관리와 UI·UX 개선 및 유지보수</w:t>
+      </w:r>
+    </w:p>
+    <w:p>
+      <w:pPr>
+        <w:keepNext/>
+      </w:pPr>
+      <w:r>
+        <w:rPr>
+          <w:b/>
+        </w:rPr>
+        <w:t>주요 성과</w:t>
+      </w:r>
+    </w:p>
+    <w:p>
+      <w:pPr>
+        <w:pStyle w:val="ListBullet"/>
+      </w:pPr>
+      <w:r>
+        <w:t>고객 접근성을 높이고 SEO 관리를 통해 광고 유입 경로 확대</w:t>
+      </w:r>
+    </w:p>
+    <w:p>
+      <w:pPr>
+        <w:pStyle w:val="Heading2"/>
+      </w:pPr>
+      <w:r>
+        <w:t>4 콘텐츠 관리 사이트 개발</w:t>
+      </w:r>
+    </w:p>
+    <w:p>
+      <w:r>
+        <w:rPr>
+          <w:b/>
+        </w:rPr>
+        <w:t xml:space="preserve">기간  </w:t>
+      </w:r>
+      <w:r>
+        <w:t>2024.07~2025.02</w:t>
+      </w:r>
+      <w:r>
+        <w:rPr>
+          <w:b/>
+        </w:rPr>
+        <w:t xml:space="preserve">    구성  </w:t>
+      </w:r>
+      <w:r>
+        <w:t>프론트엔드 1명 · 백엔드 1명</w:t>
+      </w:r>
+    </w:p>
+    <w:p>
+      <w:pPr>
+        <w:keepNext/>
+      </w:pPr>
+      <w:r>
+        <w:rPr>
+          <w:b/>
+        </w:rPr>
+        <w:t>주요 업무</w:t>
+      </w:r>
+    </w:p>
+    <w:p>
+      <w:pPr>
+        <w:pStyle w:val="ListBullet"/>
+      </w:pPr>
+      <w:r>
+        <w:t>콘텐츠 등록 게시판과 마크다운 게시판 개발</w:t>
+      </w:r>
+    </w:p>
+    <w:p>
+      <w:pPr>
+        <w:pStyle w:val="ListBullet"/>
+      </w:pPr>
+      <w:r>
+        <w:t>인증·권한에 따른 사용자 흐름 개선</w:t>
+      </w:r>
+    </w:p>
+    <w:p>
+      <w:pPr>
+        <w:pStyle w:val="ListBullet"/>
+      </w:pPr>
+      <w:r>
+        <w:t>카테고리·작성자·이미지·동영상 등 콘텐츠 등록 자동화 기능 개발</w:t>
+      </w:r>
+    </w:p>
+    <w:p>
+      <w:pPr>
+        <w:pStyle w:val="ListBullet"/>
+      </w:pPr>
+      <w:r>
+        <w:t>REST API 데이터 형식을 설계해 백엔드 개발자와 협업하고 SEO 관리</w:t>
+      </w:r>
+    </w:p>
+    <w:p>
+      <w:pPr>
+        <w:keepNext/>
+      </w:pPr>
+      <w:r>
+        <w:rPr>
+          <w:b/>
+        </w:rPr>
+        <w:t>주요 성과</w:t>
+      </w:r>
+    </w:p>
+    <w:p>
+      <w:pPr>
+        <w:pStyle w:val="ListBullet"/>
+      </w:pPr>
+      <w:r>
+        <w:t>콘텐츠 제작과 등록 과정을 자동화해 작업 시간을 약 3시간 단축</w:t>
+      </w:r>
+    </w:p>
+    <w:p>
+      <w:pPr>
+        <w:pStyle w:val="ListBullet"/>
+      </w:pPr>
+      <w:r>
+        <w:t>콘텐츠 페이지 관리 절차 단순화</w:t>
+      </w:r>
+    </w:p>
+    <w:p>
+      <w:pPr>
+        <w:pStyle w:val="Heading2"/>
+      </w:pPr>
+      <w:r>
+        <w:t>5 자사 Resource Name System 개발</w:t>
+      </w:r>
+    </w:p>
+    <w:p>
+      <w:r>
+        <w:rPr>
+          <w:b/>
+        </w:rPr>
+        <w:t xml:space="preserve">기간  </w:t>
+      </w:r>
+      <w:r>
+        <w:t>2025.02~2025.06</w:t>
+      </w:r>
+      <w:r>
+        <w:rPr>
+          <w:b/>
+        </w:rPr>
+        <w:t xml:space="preserve">    구성  </w:t>
+      </w:r>
+      <w:r>
+        <w:t>백엔드 2명 · 백엔드 개발 참여</w:t>
+      </w:r>
+    </w:p>
+    <w:p>
+      <w:pPr>
+        <w:keepNext/>
+      </w:pPr>
+      <w:r>
+        <w:rPr>
+          <w:b/>
+        </w:rPr>
+        <w:t>주요 업무</w:t>
+      </w:r>
+    </w:p>
+    <w:p>
+      <w:pPr>
+        <w:pStyle w:val="ListBullet"/>
+      </w:pPr>
+      <w:r>
+        <w:t>Resource Name System을 연구하고 업무 흐름도와 순서도 작성</w:t>
+      </w:r>
+    </w:p>
+    <w:p>
+      <w:pPr>
+        <w:pStyle w:val="ListBullet"/>
+      </w:pPr>
+      <w:r>
+        <w:t>RNS 데이터 구조 설계와 구축에서 백엔드 핵심 역할 수행</w:t>
+      </w:r>
+    </w:p>
+    <w:p>
+      <w:pPr>
+        <w:keepNext/>
+      </w:pPr>
+      <w:r>
+        <w:rPr>
+          <w:b/>
+        </w:rPr>
+        <w:t>주요 성과</w:t>
+      </w:r>
+    </w:p>
+    <w:p>
+      <w:pPr>
+        <w:pStyle w:val="ListBullet"/>
+      </w:pPr>
+      <w:r>
+        <w:t>고객 데이터 위치를 시각화해 위치 확인과 접근 절차 간소화</w:t>
+      </w:r>
+    </w:p>
+    <w:p>
+      <w:pPr>
+        <w:pStyle w:val="ListBullet"/>
+      </w:pPr>
+      <w:r>
+        <w:t>관련 부서가 고객 데이터에 접근하는 시간 단축</w:t>
       </w:r>
     </w:p>
     <w:p>
@@ -39,321 +706,43 @@
         <w:pStyle w:val="Heading1"/>
       </w:pPr>
       <w:r>
-        <w:t>2018 · 스마트 미러 졸업과제</w:t>
+        <w:t>추가 프로젝트 경험</w:t>
+      </w:r>
+    </w:p>
+    <w:p>
+      <w:pPr>
+        <w:pStyle w:val="Heading2"/>
+      </w:pPr>
+      <w:r>
+        <w:t>2018 스마트 미러 졸업과제</w:t>
       </w:r>
     </w:p>
     <w:p>
       <w:r>
-        <w:rPr>
-          <w:b/>
-        </w:rPr>
-        <w:t xml:space="preserve">능력: </w:t>
+        <w:t>팀 구성 변화 뒤 역할과 일정을 다시 나누고 필수 기능을 우선해 프로젝트를 마무리했습니다.</w:t>
       </w:r>
+    </w:p>
+    <w:p>
+      <w:pPr>
+        <w:pStyle w:val="Heading2"/>
+      </w:pPr>
       <w:r>
-        <w:t>자기조절력</w:t>
+        <w:t>2026 네트워크 보안 심화 실습</w:t>
       </w:r>
     </w:p>
     <w:p>
       <w:r>
-        <w:rPr>
-          <w:b/>
-        </w:rPr>
-        <w:t xml:space="preserve">상황: </w:t>
-      </w:r>
-      <w:r>
-        <w:t>팀원이 빠져 역할과 일정 조정이 필요함</w:t>
+        <w:t>실패한 실습을 초기화해 다시 수행하고, 동료의 질문을 설명하거나 공동 검토를 요청하며 학습을 이어갔습니다.</w:t>
       </w:r>
     </w:p>
     <w:p>
       <w:r>
-        <w:rPr>
-          <w:b/>
-        </w:rPr>
-        <w:t xml:space="preserve">행동: </w:t>
-      </w:r>
-      <w:r>
-        <w:t>남은 일을 다시 나누고 필수 기능부터 우선함</w:t>
-      </w:r>
-    </w:p>
-    <w:p>
-      <w:r>
-        <w:rPr>
-          <w:b/>
-        </w:rPr>
-        <w:t xml:space="preserve">결과: </w:t>
-      </w:r>
-      <w:r>
-        <w:t>남은 인원과 프로젝트를 마무리함</w:t>
-      </w:r>
-    </w:p>
-    <w:p>
-      <w:pPr>
-        <w:pStyle w:val="Heading1"/>
-      </w:pPr>
-      <w:r>
-        <w:t>2026-08-13 · 보안 개념 설명</w:t>
-      </w:r>
-    </w:p>
-    <w:p>
-      <w:r>
-        <w:rPr>
-          <w:b/>
-        </w:rPr>
-        <w:t xml:space="preserve">능력: </w:t>
-      </w:r>
-      <w:r>
-        <w:t>대인관계력</w:t>
-      </w:r>
-    </w:p>
-    <w:p>
-      <w:r>
-        <w:rPr>
-          <w:b/>
-        </w:rPr>
-        <w:t xml:space="preserve">상황: </w:t>
-      </w:r>
-      <w:r>
-        <w:t>동료가 보안 개념 이해에 어려움을 느낌</w:t>
-      </w:r>
-    </w:p>
-    <w:p>
-      <w:r>
-        <w:rPr>
-          <w:b/>
-        </w:rPr>
-        <w:t xml:space="preserve">행동: </w:t>
-      </w:r>
-      <w:r>
-        <w:t>질문을 듣고 기밀성·무결성·암호화를 나누어 설명함</w:t>
-      </w:r>
-    </w:p>
-    <w:p>
-      <w:r>
-        <w:rPr>
-          <w:b/>
-        </w:rPr>
-        <w:t xml:space="preserve">결과: </w:t>
-      </w:r>
-      <w:r>
-        <w:t>이해에 도움이 되었다는 피드백을 받음</w:t>
-      </w:r>
-    </w:p>
-    <w:p>
-      <w:pPr>
-        <w:pStyle w:val="Heading1"/>
-      </w:pPr>
-      <w:r>
-        <w:t>2026-08-27 · 실습 재시도</w:t>
-      </w:r>
-    </w:p>
-    <w:p>
-      <w:r>
-        <w:rPr>
-          <w:b/>
-        </w:rPr>
-        <w:t xml:space="preserve">능력: </w:t>
-      </w:r>
-      <w:r>
-        <w:t>자기동기력</w:t>
-      </w:r>
-    </w:p>
-    <w:p>
-      <w:r>
-        <w:rPr>
-          <w:b/>
-        </w:rPr>
-        <w:t xml:space="preserve">상황: </w:t>
-      </w:r>
-      <w:r>
-        <w:t>진행하던 실습이 작동하지 않음</w:t>
-      </w:r>
-    </w:p>
-    <w:p>
-      <w:r>
-        <w:rPr>
-          <w:b/>
-        </w:rPr>
-        <w:t xml:space="preserve">행동: </w:t>
-      </w:r>
-      <w:r>
-        <w:t>환경을 초기화하고 처음부터 다시 수행함</w:t>
-      </w:r>
-    </w:p>
-    <w:p>
-      <w:r>
-        <w:rPr>
-          <w:b/>
-        </w:rPr>
-        <w:t xml:space="preserve">결과: </w:t>
-      </w:r>
-      <w:r>
-        <w:t>같은 방법 반복 대신 재시도를 선택함</w:t>
-      </w:r>
-    </w:p>
-    <w:p>
-      <w:pPr>
-        <w:pStyle w:val="Heading1"/>
-      </w:pPr>
-      <w:r>
-        <w:t>2026-08-31 · 컨디션 저하 속 학습</w:t>
-      </w:r>
-    </w:p>
-    <w:p>
-      <w:r>
-        <w:rPr>
-          <w:b/>
-        </w:rPr>
-        <w:t xml:space="preserve">능력: </w:t>
-      </w:r>
-      <w:r>
-        <w:t>자기조절력</w:t>
-      </w:r>
-    </w:p>
-    <w:p>
-      <w:r>
-        <w:rPr>
-          <w:b/>
-        </w:rPr>
-        <w:t xml:space="preserve">상황: </w:t>
-      </w:r>
-      <w:r>
-        <w:t>내용이 잘 들어오지 않음</w:t>
-      </w:r>
-    </w:p>
-    <w:p>
-      <w:r>
-        <w:rPr>
-          <w:b/>
-        </w:rPr>
-        <w:t xml:space="preserve">행동: </w:t>
-      </w:r>
-      <w:r>
-        <w:t>내용을 모두 타이핑하며 이해하려 함</w:t>
-      </w:r>
-    </w:p>
-    <w:p>
-      <w:r>
-        <w:rPr>
-          <w:b/>
-        </w:rPr>
-        <w:t xml:space="preserve">결과: </w:t>
-      </w:r>
-      <w:r>
-        <w:t>그날 가능한 학습 행동을 끝까지 수행함</w:t>
-      </w:r>
-    </w:p>
-    <w:p>
-      <w:pPr>
-        <w:pStyle w:val="Heading1"/>
-      </w:pPr>
-      <w:r>
-        <w:t>2026-09-28 · 커진 과제 공동 확인</w:t>
-      </w:r>
-    </w:p>
-    <w:p>
-      <w:r>
-        <w:rPr>
-          <w:b/>
-        </w:rPr>
-        <w:t xml:space="preserve">능력: </w:t>
-      </w:r>
-      <w:r>
-        <w:t>대인관계력</w:t>
-      </w:r>
-    </w:p>
-    <w:p>
-      <w:r>
-        <w:rPr>
-          <w:b/>
-        </w:rPr>
-        <w:t xml:space="preserve">상황: </w:t>
-      </w:r>
-      <w:r>
-        <w:t>혼자 확인하기 어려울 만큼 과제가 커짐</w:t>
-      </w:r>
-    </w:p>
-    <w:p>
-      <w:r>
-        <w:rPr>
-          <w:b/>
-        </w:rPr>
-        <w:t xml:space="preserve">행동: </w:t>
-      </w:r>
-      <w:r>
-        <w:t>막힌 부분을 공유하고 조원에게 함께 검토를 요청함</w:t>
-      </w:r>
-    </w:p>
-    <w:p>
-      <w:r>
-        <w:rPr>
-          <w:b/>
-        </w:rPr>
-        <w:t xml:space="preserve">결과: </w:t>
-      </w:r>
-      <w:r>
-        <w:t>조원들과 함께 확인하며 해결 범위를 넓힘</w:t>
-      </w:r>
-    </w:p>
-    <w:p>
-      <w:pPr>
-        <w:pStyle w:val="Heading1"/>
-      </w:pPr>
-      <w:r>
-        <w:t>2026-10-01 · 해결 실마리 공유</w:t>
-      </w:r>
-    </w:p>
-    <w:p>
-      <w:r>
-        <w:rPr>
-          <w:b/>
-        </w:rPr>
-        <w:t xml:space="preserve">능력: </w:t>
-      </w:r>
-      <w:r>
-        <w:t>대인관계력</w:t>
-      </w:r>
-    </w:p>
-    <w:p>
-      <w:r>
-        <w:rPr>
-          <w:b/>
-        </w:rPr>
-        <w:t xml:space="preserve">상황: </w:t>
-      </w:r>
-      <w:r>
-        <w:t>동료가 과제 한 부분에서 막힘</w:t>
-      </w:r>
-    </w:p>
-    <w:p>
-      <w:r>
-        <w:rPr>
-          <w:b/>
-        </w:rPr>
-        <w:t xml:space="preserve">행동: </w:t>
-      </w:r>
-      <w:r>
-        <w:t>어려운 지점을 듣고 확인한 범위에서 설명함</w:t>
-      </w:r>
-    </w:p>
-    <w:p>
-      <w:r>
-        <w:rPr>
-          <w:b/>
-        </w:rPr>
-        <w:t xml:space="preserve">결과: </w:t>
-      </w:r>
-      <w:r>
-        <w:t>돌파 실마리가 되었다는 피드백을 받음</w:t>
-      </w:r>
-    </w:p>
-    <w:p>
-      <w:r>
-        <w:t>근거: 9번 확정 서사 6·8절, ritual-history-2026-10-01.json의 해당 날짜 기록.</w:t>
+        <w:t>회사 경력의 기간·역할·업무·성과는 2026-10-14 사용자가 직접 제공한 내용을 기준으로 정리했습니다. 2026년 프로젝트 장면은 리추얼 기록을 기준으로 작성했습니다.</w:t>
       </w:r>
     </w:p>
     <w:sectPr>
       <w:pgSz w:w="12240" w:h="15840"/>
-      <w:pgMar w:top="1037" w:right="1152" w:bottom="1037" w:left="1152" w:header="720" w:footer="720" w:gutter="0"/>
+      <w:pgMar w:top="979" w:right="1123" w:bottom="979" w:left="1123" w:header="720" w:footer="720" w:gutter="0"/>
       <w:cols w:space="720"/>
       <w:docGrid w:linePitch="360"/>
     </w:sectPr>
@@ -725,12 +1114,12 @@
     <w:qFormat/>
     <w:rsid w:val="00FC693F"/>
     <w:pPr>
-      <w:spacing w:after="140" w:line="307" w:lineRule="auto"/>
+      <w:spacing w:after="100" w:line="288" w:lineRule="auto"/>
     </w:pPr>
     <w:rPr>
       <w:rFonts w:ascii="Malgun Gothic" w:hAnsi="Malgun Gothic" w:eastAsia="맑은 고딕"/>
       <w:color w:val="20312B"/>
-      <w:sz w:val="21"/>
+      <w:sz w:val="20"/>
     </w:rPr>
   </w:style>
   <w:style w:type="paragraph" w:styleId="Header">
@@ -796,7 +1185,7 @@
       <w:b/>
       <w:bCs/>
       <w:color w:val="000000"/>
-      <w:sz w:val="34"/>
+      <w:sz w:val="32"/>
       <w:szCs w:val="28"/>
     </w:rPr>
   </w:style>
@@ -820,7 +1209,7 @@
       <w:b/>
       <w:bCs/>
       <w:color w:val="000000"/>
-      <w:sz w:val="26"/>
+      <w:sz w:val="25"/>
       <w:szCs w:val="26"/>
     </w:rPr>
   </w:style>
@@ -1074,6 +1463,7 @@
     <w:qFormat/>
     <w:rsid w:val="00FC693F"/>
     <w:pPr>
+      <w:keepNext/>
       <w:pBdr>
         <w:bottom w:val="single" w:sz="8" w:space="4" w:color="4F81BD" w:themeColor="accent1"/>
       </w:pBdr>
@@ -1086,7 +1476,7 @@
       <w:color w:val="000000"/>
       <w:spacing w:val="5"/>
       <w:kern w:val="28"/>
-      <w:sz w:val="56"/>
+      <w:sz w:val="52"/>
       <w:szCs w:val="52"/>
     </w:rPr>
   </w:style>

</xml_diff>

<commit_message>
Clarify confidentiality of internal company systems
</commit_message>
<xml_diff>
--- a/public/documents/김건희_경력기술서.docx
+++ b/public/documents/김건희_경력기술서.docx
@@ -37,6 +37,11 @@
     <w:p>
       <w:r>
         <w:t>스타 법무법인 전략기획본부에서 주임·팀원으로 웹개발을 담당했습니다. 단독 프론트엔드 개발을 중심으로 기획·디자인·백엔드·협력업체와 협업해 사내 운영 도구, 홈페이지, 신규 플랫폼과 콘텐츠 관리 시스템을 만들었으며, 이후 백엔드 데이터 구조 설계에도 참여했습니다.</w:t>
+      </w:r>
+    </w:p>
+    <w:p>
+      <w:r>
+        <w:t>공개 범위: 회사 홈페이지처럼 이미 공개된 결과만 링크할 수 있습니다. 관리자 페이지, 내부 운영 화면, 소스코드와 비공개 데이터는 회사 자산이므로 이 문서와 포트폴리오에 공개하지 않습니다.</w:t>
       </w:r>
     </w:p>
     <w:tbl>

</xml_diff>